<commit_message>
Embed OTel architecture diagram into PoV Word document
</commit_message>
<xml_diff>
--- a/Proof_of_Value_Multi_Agent_Observability.docx
+++ b/Proof_of_Value_Multi_Agent_Observability.docx
@@ -153,6 +153,60 @@
     <w:p>
       <w:r>
         <w:t>The application integrates the Google Vertex Agent Engine SDK with the standard OpenTelemetry SDK. The 50 metrics are collected cleanly in-memory and mapped across five core operations dashboards:</w:t>
+      </w:r>
+    </w:p>
+    <w:p>
+      <w:pPr>
+        <w:spacing w:before="240" w:after="240"/>
+        <w:jc w:val="center"/>
+      </w:pPr>
+      <w:r>
+        <w:drawing>
+          <wp:inline xmlns:a="http://schemas.openxmlformats.org/drawingml/2006/main" xmlns:pic="http://schemas.openxmlformats.org/drawingml/2006/picture">
+            <wp:extent cx="5029200" cy="5029200"/>
+            <wp:docPr id="1" name="Picture 1"/>
+            <wp:cNvGraphicFramePr>
+              <a:graphicFrameLocks noChangeAspect="1"/>
+            </wp:cNvGraphicFramePr>
+            <a:graphic>
+              <a:graphicData uri="http://schemas.openxmlformats.org/drawingml/2006/picture">
+                <pic:pic>
+                  <pic:nvPicPr>
+                    <pic:cNvPr id="0" name="otel_observability_architecture_1785175863932.png"/>
+                    <pic:cNvPicPr/>
+                  </pic:nvPicPr>
+                  <pic:blipFill>
+                    <a:blip r:embed="rId9"/>
+                    <a:stretch>
+                      <a:fillRect/>
+                    </a:stretch>
+                  </pic:blipFill>
+                  <pic:spPr>
+                    <a:xfrm>
+                      <a:off x="0" y="0"/>
+                      <a:ext cx="5029200" cy="5029200"/>
+                    </a:xfrm>
+                    <a:prstGeom prst="rect"/>
+                  </pic:spPr>
+                </pic:pic>
+              </a:graphicData>
+            </a:graphic>
+          </wp:inline>
+        </w:drawing>
+      </w:r>
+    </w:p>
+    <w:p>
+      <w:pPr>
+        <w:spacing w:after="360"/>
+        <w:jc w:val="center"/>
+      </w:pPr>
+      <w:r>
+        <w:rPr>
+          <w:i/>
+          <w:color w:val="566573"/>
+          <w:sz w:val="19"/>
+        </w:rPr>
+        <w:t>Figure 1: Vertex AI Agent Engine OpenTelemetry Production Architecture Diagram</w:t>
       </w:r>
     </w:p>
     <w:tbl>

</xml_diff>